<commit_message>
Week 02 answers .docx: state the Q1 optimum in words
Add "The optimum is at (x, y) = (0, 20), P = 340: the vertex where
2x + 3y = 60 meets the y-axis." below the Q1 graph. The PDF needs
re-exporting in Word.

Co-Authored-By: Claude Opus 5.5 <noreply@anthropic.com>
Claude-Session: https://claude.ai/code/session_01HKaqmtPGTZRp5nsgEMNNDk
[skip ci]
</commit_message>
<xml_diff>
--- a/content/Lectures/Semester 1/Week 02 - Linear Programming 1/5 Source Files/Week 2 - Linear Programming - Tutorial Answers.docx
+++ b/content/Lectures/Semester 1/Week 02 - Linear Programming 1/5 Source Files/Week 2 - Linear Programming - Tutorial Answers.docx
@@ -316,6 +316,14 @@
             </a:graphic>
           </wp:inline>
         </w:drawing>
+      </w:r>
+    </w:p>
+    <w:p>
+      <w:pPr>
+        <w:pStyle w:val="ListParagraph"/>
+      </w:pPr>
+      <w:r>
+        <w:t xml:space="preserve">The optimum is at (x, y) = (0, 20), P = 340: the vertex where 2x + 3y = 60 meets the y-axis.</w:t>
       </w:r>
     </w:p>
     <w:p>

</xml_diff>